<commit_message>
Initialize prompt for gen AI
</commit_message>
<xml_diff>
--- a/design/ArcheoEA Specifications v0-1 2026-06-14 [FR].docx
+++ b/design/ArcheoEA Specifications v0-1 2026-06-14 [FR].docx
@@ -42,7 +42,13 @@
         <w:t xml:space="preserve">Créer une application Python, complète et packagée, qui </w:t>
       </w:r>
       <w:r>
-        <w:t>permette d’importer un ou deux modèles Archimate, et de les stocker en mémoire, de rechercher / naviguer / consulter les éléments de modèles, relations, vues ou arborescences de dossiers, de l’un comme de l’autre.</w:t>
+        <w:t xml:space="preserve">permette d’importer un ou deux modèles Archimate et de les stocker en mémoire, </w:t>
+      </w:r>
+      <w:r>
+        <w:t xml:space="preserve">mais aussi – pour chacun de ces modèles - </w:t>
+      </w:r>
+      <w:r>
+        <w:t>de rechercher / naviguer / consulter les éléments de modèle, relations, vues ou arborescences de dossiers.</w:t>
       </w:r>
     </w:p>
     <w:p>
@@ -116,7 +122,37 @@
         </w:numPr>
       </w:pPr>
       <w:r>
-        <w:t>Xxx</w:t>
+        <w:t>Cartographie de patrimoines SI et Data (domaines, processus, applications, flux, objets métiers, données…), respectant impérativement le formalisme Archimate.</w:t>
+      </w:r>
+    </w:p>
+    <w:p>
+      <w:pPr>
+        <w:pStyle w:val="Paragraphedeliste"/>
+        <w:numPr>
+          <w:ilvl w:val="0"/>
+          <w:numId w:val="1"/>
+        </w:numPr>
+      </w:pPr>
+      <w:r>
+        <w:t xml:space="preserve">Interopérabilité avec les outils de modélisation et de cartographie d’architecture, notamment via les formats XML : </w:t>
+      </w:r>
+      <w:r>
+        <w:t>ArchiMate Model Exchange File Format</w:t>
+      </w:r>
+      <w:r>
+        <w:t xml:space="preserve"> (pour Archimate), XMI (pour UML), BPMN, SysML.</w:t>
+      </w:r>
+    </w:p>
+    <w:p>
+      <w:pPr>
+        <w:pStyle w:val="Paragraphedeliste"/>
+        <w:numPr>
+          <w:ilvl w:val="0"/>
+          <w:numId w:val="1"/>
+        </w:numPr>
+      </w:pPr>
+      <w:r>
+        <w:t>Manipulation de gros volumes de données (modèles Archimate).</w:t>
       </w:r>
     </w:p>
     <w:p/>
@@ -219,6 +255,15 @@
           <w:sz w:val="32"/>
           <w:szCs w:val="32"/>
         </w:rPr>
+        <w:t xml:space="preserve"> de conception et de génération des codes sources</w:t>
+      </w:r>
+      <w:r>
+        <w:rPr>
+          <w:b/>
+          <w:bCs/>
+          <w:sz w:val="32"/>
+          <w:szCs w:val="32"/>
+        </w:rPr>
         <w:t> :</w:t>
       </w:r>
     </w:p>
@@ -227,11 +272,367 @@
         <w:pStyle w:val="Paragraphedeliste"/>
         <w:numPr>
           <w:ilvl w:val="0"/>
+          <w:numId w:val="2"/>
+        </w:numPr>
+      </w:pPr>
+      <w:r>
+        <w:t>S</w:t>
+      </w:r>
+      <w:r>
+        <w:t>ystème de stockage en mémoire et de gestion des modèles Archimate</w:t>
+      </w:r>
+      <w:r>
+        <w:t xml:space="preserve"> (formats 3.2 et 4.0)</w:t>
+      </w:r>
+      <w:r>
+        <w:t>.</w:t>
+      </w:r>
+    </w:p>
+    <w:p>
+      <w:pPr>
+        <w:pStyle w:val="Paragraphedeliste"/>
+        <w:numPr>
+          <w:ilvl w:val="0"/>
+          <w:numId w:val="2"/>
+        </w:numPr>
+      </w:pPr>
+      <w:r>
+        <w:t>M</w:t>
+      </w:r>
+      <w:r>
+        <w:t>écanisme d’import et de chargement en mémoire</w:t>
+      </w:r>
+      <w:r>
+        <w:t xml:space="preserve"> </w:t>
+      </w:r>
+      <w:r>
+        <w:t>des modèles</w:t>
+      </w:r>
+      <w:r>
+        <w:t>.</w:t>
+      </w:r>
+    </w:p>
+    <w:p>
+      <w:pPr>
+        <w:pStyle w:val="Paragraphedeliste"/>
+        <w:numPr>
+          <w:ilvl w:val="0"/>
+          <w:numId w:val="2"/>
+        </w:numPr>
+      </w:pPr>
+      <w:r>
+        <w:t>F</w:t>
+      </w:r>
+      <w:r>
+        <w:t>onctionnalités de recherche, navigation, consultation dans un modèle.</w:t>
+      </w:r>
+    </w:p>
+    <w:p>
+      <w:pPr>
+        <w:pStyle w:val="Paragraphedeliste"/>
+        <w:numPr>
+          <w:ilvl w:val="0"/>
+          <w:numId w:val="2"/>
+        </w:numPr>
+      </w:pPr>
+      <w:r>
+        <w:t>Fonctionnalités de conversion d’un modèle, depuis son formalisme d’origine vers un formalisme cible.</w:t>
+      </w:r>
+    </w:p>
+    <w:p>
+      <w:pPr>
+        <w:pStyle w:val="Paragraphedeliste"/>
+        <w:numPr>
+          <w:ilvl w:val="0"/>
+          <w:numId w:val="2"/>
+        </w:numPr>
+      </w:pPr>
+      <w:r>
+        <w:t>F</w:t>
+      </w:r>
+      <w:r>
+        <w:t>onctionnalités d</w:t>
+      </w:r>
+      <w:r>
+        <w:t>’identification et d</w:t>
+      </w:r>
+      <w:r>
+        <w:t>e gestion des différences entre deux modèles.</w:t>
+      </w:r>
+    </w:p>
+    <w:p>
+      <w:pPr>
+        <w:pStyle w:val="Paragraphedeliste"/>
+        <w:numPr>
+          <w:ilvl w:val="0"/>
+          <w:numId w:val="2"/>
+        </w:numPr>
+      </w:pPr>
+      <w:r>
+        <w:t>Fonctionnalités de synthèse et de reporting résumant les caractéristiques de chaque modèle, ainsi que les différences entre ces modèles.</w:t>
+      </w:r>
+    </w:p>
+    <w:p>
+      <w:pPr>
+        <w:pStyle w:val="Paragraphedeliste"/>
+        <w:numPr>
+          <w:ilvl w:val="0"/>
+          <w:numId w:val="2"/>
+        </w:numPr>
+      </w:pPr>
+      <w:r>
+        <w:t>Fonctionnalités d’export</w:t>
+      </w:r>
+      <w:r>
+        <w:t xml:space="preserve"> (total, partiel ou filtré)</w:t>
+      </w:r>
+      <w:r>
+        <w:t xml:space="preserve"> d’un modèle Archimate au format XML standard de l’OpenGroup.</w:t>
+      </w:r>
+    </w:p>
+    <w:p>
+      <w:pPr>
+        <w:pStyle w:val="Paragraphedeliste"/>
+        <w:numPr>
+          <w:ilvl w:val="0"/>
+          <w:numId w:val="2"/>
+        </w:numPr>
+      </w:pPr>
+      <w:r>
+        <w:t>Extension des formalismes d’origine  pris en compte : BPMN, UML, SysML.</w:t>
+      </w:r>
+    </w:p>
+    <w:p/>
+    <w:p>
+      <w:pPr>
+        <w:rPr>
+          <w:b/>
+          <w:bCs/>
+          <w:sz w:val="32"/>
+          <w:szCs w:val="32"/>
+        </w:rPr>
+      </w:pPr>
+      <w:r>
+        <w:rPr>
+          <w:b/>
+          <w:bCs/>
+          <w:sz w:val="32"/>
+          <w:szCs w:val="32"/>
+        </w:rPr>
+        <w:t>R</w:t>
+      </w:r>
+      <w:r>
+        <w:rPr>
+          <w:b/>
+          <w:bCs/>
+          <w:sz w:val="32"/>
+          <w:szCs w:val="32"/>
+        </w:rPr>
+        <w:t>èg</w:t>
+      </w:r>
+      <w:r>
+        <w:rPr>
+          <w:b/>
+          <w:bCs/>
+          <w:sz w:val="32"/>
+          <w:szCs w:val="32"/>
+        </w:rPr>
+        <w:t>les</w:t>
+      </w:r>
+      <w:r>
+        <w:rPr>
+          <w:b/>
+          <w:bCs/>
+          <w:sz w:val="32"/>
+          <w:szCs w:val="32"/>
+        </w:rPr>
+        <w:t> :</w:t>
+      </w:r>
+    </w:p>
+    <w:p>
+      <w:pPr>
+        <w:pStyle w:val="Paragraphedeliste"/>
+        <w:numPr>
+          <w:ilvl w:val="0"/>
           <w:numId w:val="1"/>
         </w:numPr>
       </w:pPr>
       <w:r>
-        <w:t>Xxx</w:t>
+        <w:t>Réponds en anglais, tout au long de ton analyse et de la génération de code.</w:t>
+      </w:r>
+    </w:p>
+    <w:p>
+      <w:pPr>
+        <w:pStyle w:val="Paragraphedeliste"/>
+        <w:numPr>
+          <w:ilvl w:val="0"/>
+          <w:numId w:val="1"/>
+        </w:numPr>
+      </w:pPr>
+      <w:r>
+        <w:t>Construis une application</w:t>
+      </w:r>
+      <w:r>
+        <w:t xml:space="preserve"> autonome, </w:t>
+      </w:r>
+      <w:r>
+        <w:t xml:space="preserve">entièrement paramétrable, </w:t>
+      </w:r>
+      <w:r>
+        <w:t xml:space="preserve">déployable sur serveur et entièrement accessible via un ensemble d’API </w:t>
+      </w:r>
+      <w:r>
+        <w:t xml:space="preserve">– compatible OpenAPI – </w:t>
+      </w:r>
+      <w:r>
+        <w:t>d’utilisation des fonctionnalités de l’application, mais aussi d’administration de celle-ci.</w:t>
+      </w:r>
+    </w:p>
+    <w:p>
+      <w:pPr>
+        <w:pStyle w:val="Paragraphedeliste"/>
+        <w:numPr>
+          <w:ilvl w:val="0"/>
+          <w:numId w:val="1"/>
+        </w:numPr>
+      </w:pPr>
+      <w:r>
+        <w:t xml:space="preserve">Génère un code Python, </w:t>
+      </w:r>
+      <w:r>
+        <w:t>structuré en différents modules</w:t>
+      </w:r>
+      <w:r>
+        <w:t xml:space="preserve"> et extensible, en te basant sur les meilleures pratiques et techniques actuelles</w:t>
+      </w:r>
+      <w:r>
+        <w:t>, et respectant un système de typage avancé (Pydantic)</w:t>
+      </w:r>
+      <w:r>
+        <w:t>.</w:t>
+      </w:r>
+    </w:p>
+    <w:p>
+      <w:pPr>
+        <w:pStyle w:val="Paragraphedeliste"/>
+        <w:numPr>
+          <w:ilvl w:val="0"/>
+          <w:numId w:val="1"/>
+        </w:numPr>
+      </w:pPr>
+      <w:r>
+        <w:t>Privilégie l</w:t>
+      </w:r>
+      <w:r>
+        <w:t>es traitements en mémoire, soit via une arborescence de DataClass spécialisées, soit via une base de données mémoire.</w:t>
+      </w:r>
+    </w:p>
+    <w:p>
+      <w:pPr>
+        <w:pStyle w:val="Paragraphedeliste"/>
+        <w:numPr>
+          <w:ilvl w:val="0"/>
+          <w:numId w:val="1"/>
+        </w:numPr>
+      </w:pPr>
+      <w:r>
+        <w:t>Génère des commentaires</w:t>
+      </w:r>
+      <w:r>
+        <w:t>,</w:t>
+      </w:r>
+      <w:r>
+        <w:t xml:space="preserve"> </w:t>
+      </w:r>
+      <w:r>
+        <w:t>pour</w:t>
+      </w:r>
+      <w:r>
+        <w:t xml:space="preserve"> chaque module et fichier de code source ou de test</w:t>
+      </w:r>
+      <w:r>
+        <w:t xml:space="preserve">, traite les exceptions et </w:t>
+      </w:r>
+      <w:r>
+        <w:t>l</w:t>
+      </w:r>
+      <w:r>
+        <w:t>es logs applicatifs</w:t>
+      </w:r>
+      <w:r>
+        <w:t>.</w:t>
+      </w:r>
+    </w:p>
+    <w:p>
+      <w:pPr>
+        <w:pStyle w:val="Paragraphedeliste"/>
+        <w:numPr>
+          <w:ilvl w:val="0"/>
+          <w:numId w:val="1"/>
+        </w:numPr>
+      </w:pPr>
+      <w:r>
+        <w:t>Pour chaque fichier de code Python, génère les</w:t>
+      </w:r>
+      <w:r>
+        <w:t xml:space="preserve"> codes de</w:t>
+      </w:r>
+      <w:r>
+        <w:t xml:space="preserve"> tests correspondants</w:t>
+      </w:r>
+      <w:r>
+        <w:t xml:space="preserve">, exécutables </w:t>
+      </w:r>
+      <w:r>
+        <w:t>directement via</w:t>
+      </w:r>
+      <w:r>
+        <w:t xml:space="preserve"> </w:t>
+      </w:r>
+      <w:r>
+        <w:t>PyTest</w:t>
+      </w:r>
+      <w:r>
+        <w:t xml:space="preserve"> </w:t>
+      </w:r>
+      <w:r>
+        <w:t>ou via les API de l’application</w:t>
+      </w:r>
+      <w:r>
+        <w:t xml:space="preserve"> </w:t>
+      </w:r>
+      <w:r>
+        <w:t xml:space="preserve">(compatible </w:t>
+      </w:r>
+      <w:r>
+        <w:t>outils de test : Insomnia, Bruno ou ApiDog)</w:t>
+      </w:r>
+      <w:r>
+        <w:t>.</w:t>
+      </w:r>
+    </w:p>
+    <w:p>
+      <w:pPr>
+        <w:pStyle w:val="Paragraphedeliste"/>
+        <w:numPr>
+          <w:ilvl w:val="0"/>
+          <w:numId w:val="1"/>
+        </w:numPr>
+      </w:pPr>
+      <w:r>
+        <w:t xml:space="preserve">Propose une IHM minimale d’accès aux fonctionnalités, </w:t>
+      </w:r>
+      <w:r>
+        <w:t>ainsi qu’</w:t>
+      </w:r>
+      <w:r>
+        <w:t xml:space="preserve">une </w:t>
+      </w:r>
+      <w:r>
+        <w:t>IHM</w:t>
+      </w:r>
+      <w:r>
+        <w:t xml:space="preserve"> d’administration.</w:t>
       </w:r>
     </w:p>
     <w:p/>
@@ -251,25 +652,25 @@
           <w:sz w:val="32"/>
           <w:szCs w:val="32"/>
         </w:rPr>
-        <w:t>R</w:t>
-      </w:r>
-      <w:r>
-        <w:rPr>
-          <w:b/>
-          <w:bCs/>
-          <w:sz w:val="32"/>
-          <w:szCs w:val="32"/>
-        </w:rPr>
-        <w:t>èg</w:t>
-      </w:r>
-      <w:r>
-        <w:rPr>
-          <w:b/>
-          <w:bCs/>
-          <w:sz w:val="32"/>
-          <w:szCs w:val="32"/>
-        </w:rPr>
-        <w:t>les</w:t>
+        <w:t>Contraint</w:t>
+      </w:r>
+      <w:r>
+        <w:rPr>
+          <w:b/>
+          <w:bCs/>
+          <w:sz w:val="32"/>
+          <w:szCs w:val="32"/>
+        </w:rPr>
+        <w:t>e</w:t>
+      </w:r>
+      <w:r>
+        <w:rPr>
+          <w:b/>
+          <w:bCs/>
+          <w:sz w:val="32"/>
+          <w:szCs w:val="32"/>
+        </w:rPr>
+        <w:t>s</w:t>
       </w:r>
       <w:r>
         <w:rPr>
@@ -290,307 +691,13 @@
         </w:numPr>
       </w:pPr>
       <w:r>
-        <w:t>Réponds en anglais, tout au long de ton analyse et de la génération de code.</w:t>
-      </w:r>
-    </w:p>
-    <w:p>
-      <w:pPr>
-        <w:pStyle w:val="Paragraphedeliste"/>
-        <w:numPr>
-          <w:ilvl w:val="0"/>
-          <w:numId w:val="1"/>
-        </w:numPr>
-      </w:pPr>
-      <w:r>
-        <w:t>Construis une application</w:t>
-      </w:r>
-      <w:r>
-        <w:t xml:space="preserve"> autonome, déployable sur serveur et entièrement accessible via un ensemble d’API </w:t>
-      </w:r>
-      <w:r>
-        <w:t xml:space="preserve">– compatible OpenAPI – </w:t>
-      </w:r>
-      <w:r>
-        <w:t>d’utilisation des fonctionnalités de l’application, mais aussi d’administration de celle-ci.</w:t>
-      </w:r>
-    </w:p>
-    <w:p>
-      <w:pPr>
-        <w:pStyle w:val="Paragraphedeliste"/>
-        <w:numPr>
-          <w:ilvl w:val="0"/>
-          <w:numId w:val="1"/>
-        </w:numPr>
-      </w:pPr>
-      <w:r>
-        <w:t xml:space="preserve">Propose une IHM </w:t>
-      </w:r>
-      <w:r>
-        <w:t xml:space="preserve">minimale </w:t>
-      </w:r>
-      <w:r>
-        <w:t>d’adminis</w:t>
-      </w:r>
-    </w:p>
-    <w:p>
-      <w:pPr>
-        <w:pStyle w:val="Paragraphedeliste"/>
-        <w:numPr>
-          <w:ilvl w:val="0"/>
-          <w:numId w:val="1"/>
-        </w:numPr>
-      </w:pPr>
-      <w:r>
-        <w:t>Génère un code Python, modulaire et extensible, en te basant sur les meilleures pratiques et techniques actuelles.</w:t>
-      </w:r>
-    </w:p>
-    <w:p>
-      <w:pPr>
-        <w:pStyle w:val="Paragraphedeliste"/>
-        <w:numPr>
-          <w:ilvl w:val="0"/>
-          <w:numId w:val="1"/>
-        </w:numPr>
-      </w:pPr>
-      <w:r>
-        <w:t>Pour chaque fichier de code Python, génère les</w:t>
-      </w:r>
-      <w:r>
-        <w:t xml:space="preserve"> codes de</w:t>
-      </w:r>
-      <w:r>
-        <w:t xml:space="preserve"> tests correspondants</w:t>
-      </w:r>
-      <w:r>
-        <w:t xml:space="preserve">, exécutables </w:t>
-      </w:r>
-      <w:r>
-        <w:t>directement via</w:t>
-      </w:r>
-      <w:r>
-        <w:t xml:space="preserve"> </w:t>
-      </w:r>
-      <w:r>
-        <w:t>PyTest</w:t>
-      </w:r>
-      <w:r>
-        <w:t xml:space="preserve"> </w:t>
-      </w:r>
-      <w:r>
-        <w:t>ou via les API de l’application</w:t>
-      </w:r>
-      <w:r>
-        <w:t xml:space="preserve"> </w:t>
-      </w:r>
-      <w:r>
-        <w:t xml:space="preserve">(compatible </w:t>
-      </w:r>
-      <w:r>
-        <w:t>outils de test : Insomnia, Bruno ou ApiDog)</w:t>
-      </w:r>
-      <w:r>
-        <w:t>.</w:t>
-      </w:r>
-    </w:p>
-    <w:p/>
-    <w:p>
-      <w:pPr>
-        <w:rPr>
-          <w:b/>
-          <w:bCs/>
-          <w:sz w:val="32"/>
-          <w:szCs w:val="32"/>
-        </w:rPr>
-      </w:pPr>
-      <w:r>
-        <w:rPr>
-          <w:b/>
-          <w:bCs/>
-          <w:sz w:val="32"/>
-          <w:szCs w:val="32"/>
-        </w:rPr>
-        <w:t>Contraint</w:t>
-      </w:r>
-      <w:r>
-        <w:rPr>
-          <w:b/>
-          <w:bCs/>
-          <w:sz w:val="32"/>
-          <w:szCs w:val="32"/>
-        </w:rPr>
-        <w:t>e</w:t>
-      </w:r>
-      <w:r>
-        <w:rPr>
-          <w:b/>
-          <w:bCs/>
-          <w:sz w:val="32"/>
-          <w:szCs w:val="32"/>
-        </w:rPr>
-        <w:t>s</w:t>
-      </w:r>
-      <w:r>
-        <w:rPr>
-          <w:b/>
-          <w:bCs/>
-          <w:sz w:val="32"/>
-          <w:szCs w:val="32"/>
-        </w:rPr>
-        <w:t> :</w:t>
-      </w:r>
-    </w:p>
-    <w:p>
-      <w:pPr>
-        <w:pStyle w:val="Paragraphedeliste"/>
-        <w:numPr>
-          <w:ilvl w:val="0"/>
-          <w:numId w:val="1"/>
-        </w:numPr>
-      </w:pPr>
-      <w:r>
-        <w:t>Xxx</w:t>
-      </w:r>
-    </w:p>
-    <w:p/>
-    <w:p>
-      <w:pPr>
-        <w:rPr>
-          <w:b/>
-          <w:bCs/>
-          <w:sz w:val="32"/>
-          <w:szCs w:val="32"/>
-        </w:rPr>
-      </w:pPr>
-      <w:r>
-        <w:rPr>
-          <w:b/>
-          <w:bCs/>
-          <w:sz w:val="32"/>
-          <w:szCs w:val="32"/>
-        </w:rPr>
-        <w:t>El</w:t>
-      </w:r>
-      <w:r>
-        <w:rPr>
-          <w:b/>
-          <w:bCs/>
-          <w:sz w:val="32"/>
-          <w:szCs w:val="32"/>
-        </w:rPr>
-        <w:t>é</w:t>
-      </w:r>
-      <w:r>
-        <w:rPr>
-          <w:b/>
-          <w:bCs/>
-          <w:sz w:val="32"/>
-          <w:szCs w:val="32"/>
-        </w:rPr>
-        <w:t>ments</w:t>
-      </w:r>
-      <w:r>
-        <w:rPr>
-          <w:b/>
-          <w:bCs/>
-          <w:sz w:val="32"/>
-          <w:szCs w:val="32"/>
-        </w:rPr>
-        <w:t xml:space="preserve"> en entrée</w:t>
-      </w:r>
-      <w:r>
-        <w:rPr>
-          <w:b/>
-          <w:bCs/>
-          <w:sz w:val="32"/>
-          <w:szCs w:val="32"/>
-        </w:rPr>
-        <w:t> :</w:t>
-      </w:r>
-    </w:p>
-    <w:p>
-      <w:pPr>
-        <w:pStyle w:val="Paragraphedeliste"/>
-        <w:numPr>
-          <w:ilvl w:val="0"/>
-          <w:numId w:val="1"/>
-        </w:numPr>
-      </w:pPr>
-      <w:r>
-        <w:t>Xxx</w:t>
-      </w:r>
-    </w:p>
-    <w:p/>
-    <w:p>
-      <w:pPr>
-        <w:rPr>
-          <w:b/>
-          <w:bCs/>
-          <w:sz w:val="32"/>
-          <w:szCs w:val="32"/>
-        </w:rPr>
-      </w:pPr>
-      <w:r>
-        <w:rPr>
-          <w:b/>
-          <w:bCs/>
-          <w:sz w:val="32"/>
-          <w:szCs w:val="32"/>
-        </w:rPr>
-        <w:t>El</w:t>
-      </w:r>
-      <w:r>
-        <w:rPr>
-          <w:b/>
-          <w:bCs/>
-          <w:sz w:val="32"/>
-          <w:szCs w:val="32"/>
-        </w:rPr>
-        <w:t>é</w:t>
-      </w:r>
-      <w:r>
-        <w:rPr>
-          <w:b/>
-          <w:bCs/>
-          <w:sz w:val="32"/>
-          <w:szCs w:val="32"/>
-        </w:rPr>
-        <w:t>ments</w:t>
-      </w:r>
-      <w:r>
-        <w:rPr>
-          <w:b/>
-          <w:bCs/>
-          <w:sz w:val="32"/>
-          <w:szCs w:val="32"/>
-        </w:rPr>
-        <w:t xml:space="preserve"> en sortie</w:t>
-      </w:r>
-      <w:r>
-        <w:rPr>
-          <w:b/>
-          <w:bCs/>
-          <w:sz w:val="32"/>
-          <w:szCs w:val="32"/>
-        </w:rPr>
-        <w:t> :</w:t>
-      </w:r>
-    </w:p>
-    <w:p>
-      <w:pPr>
-        <w:pStyle w:val="Paragraphedeliste"/>
-        <w:numPr>
-          <w:ilvl w:val="0"/>
-          <w:numId w:val="1"/>
-        </w:numPr>
-      </w:pPr>
-      <w:r>
-        <w:t>Xxx</w:t>
+        <w:t>Formalisme Archimate en version 3.2 et 4.0.</w:t>
       </w:r>
     </w:p>
     <w:p/>
     <w:sectPr>
       <w:pgSz w:w="11906" w:h="16838" w:code="9"/>
-      <w:pgMar w:top="1021" w:right="1021" w:bottom="1021" w:left="1021" w:header="397" w:footer="397" w:gutter="0"/>
+      <w:pgMar w:top="851" w:right="851" w:bottom="1021" w:left="851" w:header="397" w:footer="397" w:gutter="0"/>
       <w:cols w:space="708"/>
       <w:docGrid w:linePitch="360"/>
     </w:sectPr>
@@ -713,8 +820,124 @@
       </w:rPr>
     </w:lvl>
   </w:abstractNum>
+  <w:abstractNum w:abstractNumId="1" w15:restartNumberingAfterBreak="0">
+    <w:nsid w:val="6C3C7FC1"/>
+    <w:multiLevelType w:val="hybridMultilevel"/>
+    <w:tmpl w:val="DC7AC2F6"/>
+    <w:lvl w:ilvl="0" w:tplc="040C000F">
+      <w:start w:val="1"/>
+      <w:numFmt w:val="decimal"/>
+      <w:lvlText w:val="%1."/>
+      <w:lvlJc w:val="left"/>
+      <w:pPr>
+        <w:ind w:left="720" w:hanging="360"/>
+      </w:pPr>
+      <w:rPr>
+        <w:rFonts w:hint="default"/>
+      </w:rPr>
+    </w:lvl>
+    <w:lvl w:ilvl="1" w:tplc="FFFFFFFF" w:tentative="1">
+      <w:start w:val="1"/>
+      <w:numFmt w:val="bullet"/>
+      <w:lvlText w:val="o"/>
+      <w:lvlJc w:val="left"/>
+      <w:pPr>
+        <w:ind w:left="1440" w:hanging="360"/>
+      </w:pPr>
+      <w:rPr>
+        <w:rFonts w:ascii="Courier New" w:hAnsi="Courier New" w:cs="Courier New" w:hint="default"/>
+      </w:rPr>
+    </w:lvl>
+    <w:lvl w:ilvl="2" w:tplc="FFFFFFFF" w:tentative="1">
+      <w:start w:val="1"/>
+      <w:numFmt w:val="bullet"/>
+      <w:lvlText w:val=""/>
+      <w:lvlJc w:val="left"/>
+      <w:pPr>
+        <w:ind w:left="2160" w:hanging="360"/>
+      </w:pPr>
+      <w:rPr>
+        <w:rFonts w:ascii="Wingdings" w:hAnsi="Wingdings" w:hint="default"/>
+      </w:rPr>
+    </w:lvl>
+    <w:lvl w:ilvl="3" w:tplc="FFFFFFFF" w:tentative="1">
+      <w:start w:val="1"/>
+      <w:numFmt w:val="bullet"/>
+      <w:lvlText w:val=""/>
+      <w:lvlJc w:val="left"/>
+      <w:pPr>
+        <w:ind w:left="2880" w:hanging="360"/>
+      </w:pPr>
+      <w:rPr>
+        <w:rFonts w:ascii="Symbol" w:hAnsi="Symbol" w:hint="default"/>
+      </w:rPr>
+    </w:lvl>
+    <w:lvl w:ilvl="4" w:tplc="FFFFFFFF" w:tentative="1">
+      <w:start w:val="1"/>
+      <w:numFmt w:val="bullet"/>
+      <w:lvlText w:val="o"/>
+      <w:lvlJc w:val="left"/>
+      <w:pPr>
+        <w:ind w:left="3600" w:hanging="360"/>
+      </w:pPr>
+      <w:rPr>
+        <w:rFonts w:ascii="Courier New" w:hAnsi="Courier New" w:cs="Courier New" w:hint="default"/>
+      </w:rPr>
+    </w:lvl>
+    <w:lvl w:ilvl="5" w:tplc="FFFFFFFF" w:tentative="1">
+      <w:start w:val="1"/>
+      <w:numFmt w:val="bullet"/>
+      <w:lvlText w:val=""/>
+      <w:lvlJc w:val="left"/>
+      <w:pPr>
+        <w:ind w:left="4320" w:hanging="360"/>
+      </w:pPr>
+      <w:rPr>
+        <w:rFonts w:ascii="Wingdings" w:hAnsi="Wingdings" w:hint="default"/>
+      </w:rPr>
+    </w:lvl>
+    <w:lvl w:ilvl="6" w:tplc="FFFFFFFF" w:tentative="1">
+      <w:start w:val="1"/>
+      <w:numFmt w:val="bullet"/>
+      <w:lvlText w:val=""/>
+      <w:lvlJc w:val="left"/>
+      <w:pPr>
+        <w:ind w:left="5040" w:hanging="360"/>
+      </w:pPr>
+      <w:rPr>
+        <w:rFonts w:ascii="Symbol" w:hAnsi="Symbol" w:hint="default"/>
+      </w:rPr>
+    </w:lvl>
+    <w:lvl w:ilvl="7" w:tplc="FFFFFFFF" w:tentative="1">
+      <w:start w:val="1"/>
+      <w:numFmt w:val="bullet"/>
+      <w:lvlText w:val="o"/>
+      <w:lvlJc w:val="left"/>
+      <w:pPr>
+        <w:ind w:left="5760" w:hanging="360"/>
+      </w:pPr>
+      <w:rPr>
+        <w:rFonts w:ascii="Courier New" w:hAnsi="Courier New" w:cs="Courier New" w:hint="default"/>
+      </w:rPr>
+    </w:lvl>
+    <w:lvl w:ilvl="8" w:tplc="FFFFFFFF" w:tentative="1">
+      <w:start w:val="1"/>
+      <w:numFmt w:val="bullet"/>
+      <w:lvlText w:val=""/>
+      <w:lvlJc w:val="left"/>
+      <w:pPr>
+        <w:ind w:left="6480" w:hanging="360"/>
+      </w:pPr>
+      <w:rPr>
+        <w:rFonts w:ascii="Wingdings" w:hAnsi="Wingdings" w:hint="default"/>
+      </w:rPr>
+    </w:lvl>
+  </w:abstractNum>
   <w:num w:numId="1" w16cid:durableId="1822119264">
     <w:abstractNumId w:val="0"/>
+  </w:num>
+  <w:num w:numId="2" w16cid:durableId="1686439134">
+    <w:abstractNumId w:val="1"/>
   </w:num>
 </w:numbering>
 </file>

</xml_diff>